<commit_message>
feat: worked on 401 refresh token break and improve UI
</commit_message>
<xml_diff>
--- a/Notes/AuthNexus other API documentation.docx
+++ b/Notes/AuthNexus other API documentation.docx
@@ -640,54 +640,374 @@
         </w:rPr>
         <w:t>John Doe</w:t>
       </w:r>
+      <w:r>
+        <w:rPr>
+          <w:rFonts w:ascii="Courier New" w:hAnsi="Courier New" w:cs="Courier New"/>
+          <w:sz w:val="21"/>
+          <w:szCs w:val="21"/>
+          <w:bdr w:val="single" w:sz="2" w:space="0" w:color="E5E7EB" w:frame="1"/>
+        </w:rPr>
+        <w:t>",</w:t>
+      </w:r>
+    </w:p>
+    <w:p>
+      <w:pPr>
+        <w:pStyle w:val="Heading2"/>
+        <w:rPr>
+          <w:rFonts w:ascii="Courier New" w:hAnsi="Courier New" w:cs="Courier New"/>
+          <w:sz w:val="21"/>
+          <w:szCs w:val="21"/>
+        </w:rPr>
+      </w:pPr>
+      <w:r>
+        <w:rPr>
+          <w:rFonts w:ascii="Courier New" w:hAnsi="Courier New" w:cs="Courier New"/>
+          <w:sz w:val="21"/>
+          <w:szCs w:val="21"/>
+          <w:bdr w:val="single" w:sz="2" w:space="0" w:color="E5E7EB" w:frame="1"/>
+        </w:rPr>
+        <w:t xml:space="preserve">    "roles": ["admin"],</w:t>
+      </w:r>
+    </w:p>
+    <w:p>
+      <w:pPr>
+        <w:pStyle w:val="Heading2"/>
+        <w:rPr>
+          <w:rFonts w:ascii="Courier New" w:hAnsi="Courier New" w:cs="Courier New"/>
+          <w:sz w:val="21"/>
+          <w:szCs w:val="21"/>
+        </w:rPr>
+      </w:pPr>
+      <w:r>
+        <w:rPr>
+          <w:rFonts w:ascii="Courier New" w:hAnsi="Courier New" w:cs="Courier New"/>
+          <w:sz w:val="21"/>
+          <w:szCs w:val="21"/>
+          <w:bdr w:val="single" w:sz="2" w:space="0" w:color="E5E7EB" w:frame="1"/>
+        </w:rPr>
+        <w:t xml:space="preserve">    "</w:t>
+      </w:r>
+      <w:proofErr w:type="spellStart"/>
+      <w:r>
+        <w:rPr>
+          <w:rFonts w:ascii="Courier New" w:hAnsi="Courier New" w:cs="Courier New"/>
+          <w:sz w:val="21"/>
+          <w:szCs w:val="21"/>
+          <w:bdr w:val="single" w:sz="2" w:space="0" w:color="E5E7EB" w:frame="1"/>
+        </w:rPr>
+        <w:t>org_id</w:t>
+      </w:r>
+      <w:proofErr w:type="spellEnd"/>
+      <w:r>
+        <w:rPr>
+          <w:rFonts w:ascii="Courier New" w:hAnsi="Courier New" w:cs="Courier New"/>
+          <w:sz w:val="21"/>
+          <w:szCs w:val="21"/>
+          <w:bdr w:val="single" w:sz="2" w:space="0" w:color="E5E7EB" w:frame="1"/>
+        </w:rPr>
+        <w:t>": "369213414641238019",</w:t>
+      </w:r>
+    </w:p>
+    <w:p>
+      <w:pPr>
+        <w:pStyle w:val="Heading2"/>
+        <w:rPr>
+          <w:rFonts w:ascii="Courier New" w:hAnsi="Courier New" w:cs="Courier New"/>
+          <w:sz w:val="21"/>
+          <w:szCs w:val="21"/>
+        </w:rPr>
+      </w:pPr>
+      <w:r>
+        <w:rPr>
+          <w:rFonts w:ascii="Courier New" w:hAnsi="Courier New" w:cs="Courier New"/>
+          <w:sz w:val="21"/>
+          <w:szCs w:val="21"/>
+          <w:bdr w:val="single" w:sz="2" w:space="0" w:color="E5E7EB" w:frame="1"/>
+        </w:rPr>
+        <w:t xml:space="preserve">    "</w:t>
+      </w:r>
+      <w:proofErr w:type="spellStart"/>
+      <w:r>
+        <w:rPr>
+          <w:rFonts w:ascii="Courier New" w:hAnsi="Courier New" w:cs="Courier New"/>
+          <w:sz w:val="21"/>
+          <w:szCs w:val="21"/>
+          <w:bdr w:val="single" w:sz="2" w:space="0" w:color="E5E7EB" w:frame="1"/>
+        </w:rPr>
+        <w:t>project_id</w:t>
+      </w:r>
+      <w:proofErr w:type="spellEnd"/>
+      <w:r>
+        <w:rPr>
+          <w:rFonts w:ascii="Courier New" w:hAnsi="Courier New" w:cs="Courier New"/>
+          <w:sz w:val="21"/>
+          <w:szCs w:val="21"/>
+          <w:bdr w:val="single" w:sz="2" w:space="0" w:color="E5E7EB" w:frame="1"/>
+        </w:rPr>
+        <w:t>": "370434017184448515",</w:t>
+      </w:r>
+    </w:p>
+    <w:p>
+      <w:pPr>
+        <w:pStyle w:val="Heading2"/>
+        <w:rPr>
+          <w:rFonts w:ascii="Courier New" w:hAnsi="Courier New" w:cs="Courier New"/>
+          <w:sz w:val="21"/>
+          <w:szCs w:val="21"/>
+        </w:rPr>
+      </w:pPr>
+      <w:r>
+        <w:rPr>
+          <w:rFonts w:ascii="Courier New" w:hAnsi="Courier New" w:cs="Courier New"/>
+          <w:sz w:val="21"/>
+          <w:szCs w:val="21"/>
+          <w:bdr w:val="single" w:sz="2" w:space="0" w:color="E5E7EB" w:frame="1"/>
+        </w:rPr>
+        <w:t xml:space="preserve">    "</w:t>
+      </w:r>
+      <w:proofErr w:type="spellStart"/>
+      <w:r>
+        <w:rPr>
+          <w:rFonts w:ascii="Courier New" w:hAnsi="Courier New" w:cs="Courier New"/>
+          <w:sz w:val="21"/>
+          <w:szCs w:val="21"/>
+          <w:bdr w:val="single" w:sz="2" w:space="0" w:color="E5E7EB" w:frame="1"/>
+        </w:rPr>
+        <w:t>nexus_projects</w:t>
+      </w:r>
+      <w:proofErr w:type="spellEnd"/>
+      <w:r>
+        <w:rPr>
+          <w:rFonts w:ascii="Courier New" w:hAnsi="Courier New" w:cs="Courier New"/>
+          <w:sz w:val="21"/>
+          <w:szCs w:val="21"/>
+          <w:bdr w:val="single" w:sz="2" w:space="0" w:color="E5E7EB" w:frame="1"/>
+        </w:rPr>
+        <w:t>": [...]</w:t>
+      </w:r>
+    </w:p>
+    <w:p>
+      <w:pPr>
+        <w:pStyle w:val="Heading2"/>
+        <w:rPr>
+          <w:rFonts w:ascii="Courier New" w:hAnsi="Courier New" w:cs="Courier New"/>
+          <w:sz w:val="21"/>
+          <w:szCs w:val="21"/>
+        </w:rPr>
+      </w:pPr>
+      <w:r>
+        <w:rPr>
+          <w:rFonts w:ascii="Courier New" w:hAnsi="Courier New" w:cs="Courier New"/>
+          <w:sz w:val="21"/>
+          <w:szCs w:val="21"/>
+          <w:bdr w:val="single" w:sz="2" w:space="0" w:color="E5E7EB" w:frame="1"/>
+        </w:rPr>
+        <w:t xml:space="preserve">  }</w:t>
+      </w:r>
+    </w:p>
+    <w:p>
+      <w:pPr>
+        <w:pStyle w:val="Heading2"/>
+        <w:rPr>
+          <w:rFonts w:ascii="Courier New" w:hAnsi="Courier New" w:cs="Courier New"/>
+          <w:sz w:val="21"/>
+          <w:szCs w:val="21"/>
+        </w:rPr>
+      </w:pPr>
+      <w:r>
+        <w:rPr>
+          <w:rFonts w:ascii="Courier New" w:hAnsi="Courier New" w:cs="Courier New"/>
+          <w:sz w:val="21"/>
+          <w:szCs w:val="21"/>
+          <w:bdr w:val="single" w:sz="2" w:space="0" w:color="E5E7EB" w:frame="1"/>
+        </w:rPr>
+        <w:t>}</w:t>
+      </w:r>
+    </w:p>
+    <w:p>
+      <w:pPr>
+        <w:pStyle w:val="Heading2"/>
+        <w:rPr>
+          <w:sz w:val="27"/>
+          <w:szCs w:val="27"/>
+        </w:rPr>
+      </w:pPr>
+      <w:r>
+        <w:rPr>
+          <w:sz w:val="27"/>
+          <w:szCs w:val="27"/>
+        </w:rPr>
+        <w:t>1.2 Token Refresh</w:t>
+      </w:r>
+    </w:p>
+    <w:p>
+      <w:pPr>
+        <w:pStyle w:val="Heading2"/>
+        <w:rPr>
+          <w:sz w:val="21"/>
+          <w:szCs w:val="21"/>
+        </w:rPr>
+      </w:pPr>
+      <w:r>
+        <w:rPr>
+          <w:sz w:val="21"/>
+          <w:szCs w:val="21"/>
+        </w:rPr>
+        <w:t>Used to maintain session continuity using a refresh token.</w:t>
+      </w:r>
+    </w:p>
+    <w:p>
+      <w:pPr>
+        <w:pStyle w:val="Heading2"/>
+        <w:rPr>
+          <w:sz w:val="21"/>
+          <w:szCs w:val="21"/>
+        </w:rPr>
+      </w:pPr>
+      <w:r>
+        <w:rPr>
+          <w:sz w:val="21"/>
+          <w:szCs w:val="21"/>
+          <w:bdr w:val="single" w:sz="2" w:space="0" w:color="E5E7EB" w:frame="1"/>
+        </w:rPr>
+        <w:t>Endpoint:</w:t>
+      </w:r>
+      <w:r>
+        <w:rPr>
+          <w:sz w:val="21"/>
+          <w:szCs w:val="21"/>
+        </w:rPr>
+        <w:t> </w:t>
+      </w:r>
+      <w:r>
+        <w:rPr>
+          <w:rFonts w:ascii="Consolas" w:hAnsi="Consolas" w:cs="Courier New"/>
+          <w:sz w:val="19"/>
+          <w:szCs w:val="19"/>
+          <w:bdr w:val="single" w:sz="2" w:space="0" w:color="E5E7EB" w:frame="1"/>
+          <w:shd w:val="clear" w:color="auto" w:fill="3C3C3C"/>
+        </w:rPr>
+        <w:t>POST /</w:t>
+      </w:r>
+      <w:proofErr w:type="spellStart"/>
+      <w:r>
+        <w:rPr>
+          <w:rFonts w:ascii="Consolas" w:hAnsi="Consolas" w:cs="Courier New"/>
+          <w:sz w:val="19"/>
+          <w:szCs w:val="19"/>
+          <w:bdr w:val="single" w:sz="2" w:space="0" w:color="E5E7EB" w:frame="1"/>
+          <w:shd w:val="clear" w:color="auto" w:fill="3C3C3C"/>
+        </w:rPr>
+        <w:t>api</w:t>
+      </w:r>
+      <w:proofErr w:type="spellEnd"/>
+      <w:r>
+        <w:rPr>
+          <w:rFonts w:ascii="Consolas" w:hAnsi="Consolas" w:cs="Courier New"/>
+          <w:sz w:val="19"/>
+          <w:szCs w:val="19"/>
+          <w:bdr w:val="single" w:sz="2" w:space="0" w:color="E5E7EB" w:frame="1"/>
+          <w:shd w:val="clear" w:color="auto" w:fill="3C3C3C"/>
+        </w:rPr>
+        <w:t>/auth/refresh</w:t>
+      </w:r>
+      <w:r>
+        <w:rPr>
+          <w:rFonts w:ascii="Consolas" w:hAnsi="Consolas" w:cs="Courier New"/>
+          <w:sz w:val="19"/>
+          <w:szCs w:val="19"/>
+          <w:bdr w:val="single" w:sz="2" w:space="0" w:color="E5E7EB" w:frame="1"/>
+          <w:shd w:val="clear" w:color="auto" w:fill="3C3C3C"/>
+        </w:rPr>
+        <w:br/>
+      </w:r>
+      <w:r>
+        <w:rPr>
+          <w:rFonts w:ascii="Consolas" w:hAnsi="Consolas" w:cs="Courier New"/>
+          <w:sz w:val="19"/>
+          <w:szCs w:val="19"/>
+          <w:bdr w:val="single" w:sz="2" w:space="0" w:color="E5E7EB" w:frame="1"/>
+          <w:shd w:val="clear" w:color="auto" w:fill="3C3C3C"/>
+        </w:rPr>
+        <w:t>Note: Refresh token store in cookie</w:t>
+      </w:r>
+      <w:r>
+        <w:rPr>
+          <w:rFonts w:ascii="Consolas" w:hAnsi="Consolas" w:cs="Courier New"/>
+          <w:sz w:val="19"/>
+          <w:szCs w:val="19"/>
+          <w:bdr w:val="single" w:sz="2" w:space="0" w:color="E5E7EB" w:frame="1"/>
+          <w:shd w:val="clear" w:color="auto" w:fill="3C3C3C"/>
+        </w:rPr>
+        <w:br/>
+      </w:r>
+      <w:r>
+        <w:rPr>
+          <w:rFonts w:ascii="Consolas" w:hAnsi="Consolas" w:cs="Courier New"/>
+          <w:sz w:val="19"/>
+          <w:szCs w:val="19"/>
+          <w:bdr w:val="single" w:sz="2" w:space="0" w:color="E5E7EB" w:frame="1"/>
+          <w:shd w:val="clear" w:color="auto" w:fill="3C3C3C"/>
+        </w:rPr>
+        <w:br/>
+      </w:r>
+      <w:proofErr w:type="spellStart"/>
+      <w:r>
+        <w:rPr>
+          <w:sz w:val="21"/>
+          <w:szCs w:val="21"/>
+          <w:bdr w:val="single" w:sz="2" w:space="0" w:color="E5E7EB" w:frame="1"/>
+        </w:rPr>
+        <w:t>Cookie</w:t>
+      </w:r>
+      <w:proofErr w:type="spellEnd"/>
+      <w:r>
+        <w:rPr>
+          <w:sz w:val="21"/>
+          <w:szCs w:val="21"/>
+          <w:bdr w:val="single" w:sz="2" w:space="0" w:color="E5E7EB" w:frame="1"/>
+        </w:rPr>
+        <w:t>:</w:t>
+      </w:r>
       <w:bookmarkStart w:id="0" w:name="_GoBack"/>
       <w:bookmarkEnd w:id="0"/>
-      <w:r>
-        <w:rPr>
-          <w:rFonts w:ascii="Courier New" w:hAnsi="Courier New" w:cs="Courier New"/>
-          <w:sz w:val="21"/>
-          <w:szCs w:val="21"/>
-          <w:bdr w:val="single" w:sz="2" w:space="0" w:color="E5E7EB" w:frame="1"/>
-        </w:rPr>
-        <w:t>",</w:t>
-      </w:r>
-    </w:p>
-    <w:p>
-      <w:pPr>
-        <w:pStyle w:val="Heading2"/>
-        <w:rPr>
-          <w:rFonts w:ascii="Courier New" w:hAnsi="Courier New" w:cs="Courier New"/>
-          <w:sz w:val="21"/>
-          <w:szCs w:val="21"/>
-        </w:rPr>
-      </w:pPr>
-      <w:r>
-        <w:rPr>
-          <w:rFonts w:ascii="Courier New" w:hAnsi="Courier New" w:cs="Courier New"/>
-          <w:sz w:val="21"/>
-          <w:szCs w:val="21"/>
-          <w:bdr w:val="single" w:sz="2" w:space="0" w:color="E5E7EB" w:frame="1"/>
-        </w:rPr>
-        <w:t xml:space="preserve">    "roles": ["admin"],</w:t>
-      </w:r>
-    </w:p>
-    <w:p>
-      <w:pPr>
-        <w:pStyle w:val="Heading2"/>
-        <w:rPr>
-          <w:rFonts w:ascii="Courier New" w:hAnsi="Courier New" w:cs="Courier New"/>
-          <w:sz w:val="21"/>
-          <w:szCs w:val="21"/>
-        </w:rPr>
-      </w:pPr>
-      <w:r>
-        <w:rPr>
-          <w:rFonts w:ascii="Courier New" w:hAnsi="Courier New" w:cs="Courier New"/>
-          <w:sz w:val="21"/>
-          <w:szCs w:val="21"/>
-          <w:bdr w:val="single" w:sz="2" w:space="0" w:color="E5E7EB" w:frame="1"/>
-        </w:rPr>
-        <w:t xml:space="preserve">    "</w:t>
+    </w:p>
+    <w:p>
+      <w:pPr>
+        <w:pStyle w:val="Heading2"/>
+        <w:rPr>
+          <w:rFonts w:ascii="Courier New" w:hAnsi="Courier New" w:cs="Courier New"/>
+          <w:sz w:val="21"/>
+          <w:szCs w:val="21"/>
+        </w:rPr>
+      </w:pPr>
+      <w:r>
+        <w:rPr>
+          <w:rFonts w:ascii="Courier New" w:hAnsi="Courier New" w:cs="Courier New"/>
+          <w:sz w:val="21"/>
+          <w:szCs w:val="21"/>
+          <w:bdr w:val="single" w:sz="2" w:space="0" w:color="E5E7EB" w:frame="1"/>
+        </w:rPr>
+        <w:t>{</w:t>
+      </w:r>
+    </w:p>
+    <w:p>
+      <w:pPr>
+        <w:pStyle w:val="Heading2"/>
+        <w:rPr>
+          <w:rFonts w:ascii="Courier New" w:hAnsi="Courier New" w:cs="Courier New"/>
+          <w:sz w:val="21"/>
+          <w:szCs w:val="21"/>
+        </w:rPr>
+      </w:pPr>
+      <w:r>
+        <w:rPr>
+          <w:rFonts w:ascii="Courier New" w:hAnsi="Courier New" w:cs="Courier New"/>
+          <w:sz w:val="21"/>
+          <w:szCs w:val="21"/>
+          <w:bdr w:val="single" w:sz="2" w:space="0" w:color="E5E7EB" w:frame="1"/>
+        </w:rPr>
+        <w:t xml:space="preserve">  "</w:t>
       </w:r>
       <w:proofErr w:type="spellStart"/>
       <w:r>
@@ -697,296 +1017,8 @@
           <w:szCs w:val="21"/>
           <w:bdr w:val="single" w:sz="2" w:space="0" w:color="E5E7EB" w:frame="1"/>
         </w:rPr>
-        <w:t>org_id</w:t>
-      </w:r>
-      <w:proofErr w:type="spellEnd"/>
-      <w:r>
-        <w:rPr>
-          <w:rFonts w:ascii="Courier New" w:hAnsi="Courier New" w:cs="Courier New"/>
-          <w:sz w:val="21"/>
-          <w:szCs w:val="21"/>
-          <w:bdr w:val="single" w:sz="2" w:space="0" w:color="E5E7EB" w:frame="1"/>
-        </w:rPr>
-        <w:t>": "369213414641238019",</w:t>
-      </w:r>
-    </w:p>
-    <w:p>
-      <w:pPr>
-        <w:pStyle w:val="Heading2"/>
-        <w:rPr>
-          <w:rFonts w:ascii="Courier New" w:hAnsi="Courier New" w:cs="Courier New"/>
-          <w:sz w:val="21"/>
-          <w:szCs w:val="21"/>
-        </w:rPr>
-      </w:pPr>
-      <w:r>
-        <w:rPr>
-          <w:rFonts w:ascii="Courier New" w:hAnsi="Courier New" w:cs="Courier New"/>
-          <w:sz w:val="21"/>
-          <w:szCs w:val="21"/>
-          <w:bdr w:val="single" w:sz="2" w:space="0" w:color="E5E7EB" w:frame="1"/>
-        </w:rPr>
-        <w:t xml:space="preserve">    "</w:t>
-      </w:r>
-      <w:proofErr w:type="spellStart"/>
-      <w:r>
-        <w:rPr>
-          <w:rFonts w:ascii="Courier New" w:hAnsi="Courier New" w:cs="Courier New"/>
-          <w:sz w:val="21"/>
-          <w:szCs w:val="21"/>
-          <w:bdr w:val="single" w:sz="2" w:space="0" w:color="E5E7EB" w:frame="1"/>
-        </w:rPr>
-        <w:t>project_id</w:t>
-      </w:r>
-      <w:proofErr w:type="spellEnd"/>
-      <w:r>
-        <w:rPr>
-          <w:rFonts w:ascii="Courier New" w:hAnsi="Courier New" w:cs="Courier New"/>
-          <w:sz w:val="21"/>
-          <w:szCs w:val="21"/>
-          <w:bdr w:val="single" w:sz="2" w:space="0" w:color="E5E7EB" w:frame="1"/>
-        </w:rPr>
-        <w:t>": "370434017184448515",</w:t>
-      </w:r>
-    </w:p>
-    <w:p>
-      <w:pPr>
-        <w:pStyle w:val="Heading2"/>
-        <w:rPr>
-          <w:rFonts w:ascii="Courier New" w:hAnsi="Courier New" w:cs="Courier New"/>
-          <w:sz w:val="21"/>
-          <w:szCs w:val="21"/>
-        </w:rPr>
-      </w:pPr>
-      <w:r>
-        <w:rPr>
-          <w:rFonts w:ascii="Courier New" w:hAnsi="Courier New" w:cs="Courier New"/>
-          <w:sz w:val="21"/>
-          <w:szCs w:val="21"/>
-          <w:bdr w:val="single" w:sz="2" w:space="0" w:color="E5E7EB" w:frame="1"/>
-        </w:rPr>
-        <w:t xml:space="preserve">    "</w:t>
-      </w:r>
-      <w:proofErr w:type="spellStart"/>
-      <w:r>
-        <w:rPr>
-          <w:rFonts w:ascii="Courier New" w:hAnsi="Courier New" w:cs="Courier New"/>
-          <w:sz w:val="21"/>
-          <w:szCs w:val="21"/>
-          <w:bdr w:val="single" w:sz="2" w:space="0" w:color="E5E7EB" w:frame="1"/>
-        </w:rPr>
-        <w:t>nexus_projects</w:t>
-      </w:r>
-      <w:proofErr w:type="spellEnd"/>
-      <w:r>
-        <w:rPr>
-          <w:rFonts w:ascii="Courier New" w:hAnsi="Courier New" w:cs="Courier New"/>
-          <w:sz w:val="21"/>
-          <w:szCs w:val="21"/>
-          <w:bdr w:val="single" w:sz="2" w:space="0" w:color="E5E7EB" w:frame="1"/>
-        </w:rPr>
-        <w:t>": [...]</w:t>
-      </w:r>
-    </w:p>
-    <w:p>
-      <w:pPr>
-        <w:pStyle w:val="Heading2"/>
-        <w:rPr>
-          <w:rFonts w:ascii="Courier New" w:hAnsi="Courier New" w:cs="Courier New"/>
-          <w:sz w:val="21"/>
-          <w:szCs w:val="21"/>
-        </w:rPr>
-      </w:pPr>
-      <w:r>
-        <w:rPr>
-          <w:rFonts w:ascii="Courier New" w:hAnsi="Courier New" w:cs="Courier New"/>
-          <w:sz w:val="21"/>
-          <w:szCs w:val="21"/>
-          <w:bdr w:val="single" w:sz="2" w:space="0" w:color="E5E7EB" w:frame="1"/>
-        </w:rPr>
-        <w:t xml:space="preserve">  }</w:t>
-      </w:r>
-    </w:p>
-    <w:p>
-      <w:pPr>
-        <w:pStyle w:val="Heading2"/>
-        <w:rPr>
-          <w:rFonts w:ascii="Courier New" w:hAnsi="Courier New" w:cs="Courier New"/>
-          <w:sz w:val="21"/>
-          <w:szCs w:val="21"/>
-        </w:rPr>
-      </w:pPr>
-      <w:r>
-        <w:rPr>
-          <w:rFonts w:ascii="Courier New" w:hAnsi="Courier New" w:cs="Courier New"/>
-          <w:sz w:val="21"/>
-          <w:szCs w:val="21"/>
-          <w:bdr w:val="single" w:sz="2" w:space="0" w:color="E5E7EB" w:frame="1"/>
-        </w:rPr>
-        <w:t>}</w:t>
-      </w:r>
-    </w:p>
-    <w:p>
-      <w:pPr>
-        <w:pStyle w:val="Heading2"/>
-        <w:rPr>
-          <w:sz w:val="27"/>
-          <w:szCs w:val="27"/>
-        </w:rPr>
-      </w:pPr>
-      <w:r>
-        <w:rPr>
-          <w:sz w:val="27"/>
-          <w:szCs w:val="27"/>
-        </w:rPr>
-        <w:t>1.2 Token Refresh</w:t>
-      </w:r>
-    </w:p>
-    <w:p>
-      <w:pPr>
-        <w:pStyle w:val="Heading2"/>
-        <w:rPr>
-          <w:sz w:val="21"/>
-          <w:szCs w:val="21"/>
-        </w:rPr>
-      </w:pPr>
-      <w:r>
-        <w:rPr>
-          <w:sz w:val="21"/>
-          <w:szCs w:val="21"/>
-        </w:rPr>
-        <w:t>Used to maintain session continuity using a refresh token.</w:t>
-      </w:r>
-    </w:p>
-    <w:p>
-      <w:pPr>
-        <w:pStyle w:val="Heading2"/>
-        <w:rPr>
-          <w:sz w:val="21"/>
-          <w:szCs w:val="21"/>
-        </w:rPr>
-      </w:pPr>
-      <w:r>
-        <w:rPr>
-          <w:sz w:val="21"/>
-          <w:szCs w:val="21"/>
-          <w:bdr w:val="single" w:sz="2" w:space="0" w:color="E5E7EB" w:frame="1"/>
-        </w:rPr>
-        <w:t>Endpoint:</w:t>
-      </w:r>
-      <w:r>
-        <w:rPr>
-          <w:sz w:val="21"/>
-          <w:szCs w:val="21"/>
-        </w:rPr>
-        <w:t> </w:t>
-      </w:r>
-      <w:r>
-        <w:rPr>
-          <w:rFonts w:ascii="Consolas" w:hAnsi="Consolas" w:cs="Courier New"/>
-          <w:sz w:val="19"/>
-          <w:szCs w:val="19"/>
-          <w:bdr w:val="single" w:sz="2" w:space="0" w:color="E5E7EB" w:frame="1"/>
-          <w:shd w:val="clear" w:color="auto" w:fill="3C3C3C"/>
-        </w:rPr>
-        <w:t>POST /</w:t>
-      </w:r>
-      <w:proofErr w:type="spellStart"/>
-      <w:r>
-        <w:rPr>
-          <w:rFonts w:ascii="Consolas" w:hAnsi="Consolas" w:cs="Courier New"/>
-          <w:sz w:val="19"/>
-          <w:szCs w:val="19"/>
-          <w:bdr w:val="single" w:sz="2" w:space="0" w:color="E5E7EB" w:frame="1"/>
-          <w:shd w:val="clear" w:color="auto" w:fill="3C3C3C"/>
-        </w:rPr>
-        <w:t>api</w:t>
-      </w:r>
-      <w:proofErr w:type="spellEnd"/>
-      <w:r>
-        <w:rPr>
-          <w:rFonts w:ascii="Consolas" w:hAnsi="Consolas" w:cs="Courier New"/>
-          <w:sz w:val="19"/>
-          <w:szCs w:val="19"/>
-          <w:bdr w:val="single" w:sz="2" w:space="0" w:color="E5E7EB" w:frame="1"/>
-          <w:shd w:val="clear" w:color="auto" w:fill="3C3C3C"/>
-        </w:rPr>
-        <w:t>/auth/refresh</w:t>
-      </w:r>
-    </w:p>
-    <w:p>
-      <w:pPr>
-        <w:pStyle w:val="Heading2"/>
-        <w:rPr>
-          <w:sz w:val="21"/>
-          <w:szCs w:val="21"/>
-        </w:rPr>
-      </w:pPr>
-      <w:r>
-        <w:rPr>
-          <w:sz w:val="21"/>
-          <w:szCs w:val="21"/>
-          <w:bdr w:val="single" w:sz="2" w:space="0" w:color="E5E7EB" w:frame="1"/>
-        </w:rPr>
-        <w:t>Request Body:</w:t>
-      </w:r>
-    </w:p>
-    <w:p>
-      <w:pPr>
-        <w:pStyle w:val="Heading2"/>
-        <w:rPr>
-          <w:rFonts w:ascii="Arial" w:hAnsi="Arial" w:cs="Arial"/>
-          <w:sz w:val="21"/>
-          <w:szCs w:val="21"/>
-        </w:rPr>
-      </w:pPr>
-      <w:r>
-        <w:rPr>
-          <w:rFonts w:ascii="Arial" w:hAnsi="Arial" w:cs="Arial"/>
-          <w:sz w:val="21"/>
-          <w:szCs w:val="21"/>
-        </w:rPr>
-        <w:t>json</w:t>
-      </w:r>
-    </w:p>
-    <w:p>
-      <w:pPr>
-        <w:pStyle w:val="Heading2"/>
-        <w:rPr>
-          <w:rFonts w:ascii="Courier New" w:hAnsi="Courier New" w:cs="Courier New"/>
-          <w:sz w:val="21"/>
-          <w:szCs w:val="21"/>
-        </w:rPr>
-      </w:pPr>
-      <w:r>
-        <w:rPr>
-          <w:rFonts w:ascii="Courier New" w:hAnsi="Courier New" w:cs="Courier New"/>
-          <w:sz w:val="21"/>
-          <w:szCs w:val="21"/>
-          <w:bdr w:val="single" w:sz="2" w:space="0" w:color="E5E7EB" w:frame="1"/>
-        </w:rPr>
-        <w:t>{</w:t>
-      </w:r>
-    </w:p>
-    <w:p>
-      <w:pPr>
-        <w:pStyle w:val="Heading2"/>
-        <w:rPr>
-          <w:rFonts w:ascii="Courier New" w:hAnsi="Courier New" w:cs="Courier New"/>
-          <w:sz w:val="21"/>
-          <w:szCs w:val="21"/>
-        </w:rPr>
-      </w:pPr>
-      <w:r>
-        <w:rPr>
-          <w:rFonts w:ascii="Courier New" w:hAnsi="Courier New" w:cs="Courier New"/>
-          <w:sz w:val="21"/>
-          <w:szCs w:val="21"/>
-          <w:bdr w:val="single" w:sz="2" w:space="0" w:color="E5E7EB" w:frame="1"/>
-        </w:rPr>
-        <w:t xml:space="preserve">  "</w:t>
-      </w:r>
-      <w:proofErr w:type="spellStart"/>
+        <w:t>nexus_</w:t>
+      </w:r>
       <w:r>
         <w:rPr>
           <w:rFonts w:ascii="Courier New" w:hAnsi="Courier New" w:cs="Courier New"/>
@@ -1208,25 +1240,25 @@
           <w:szCs w:val="21"/>
           <w:bdr w:val="single" w:sz="2" w:space="0" w:color="E5E7EB" w:frame="1"/>
         </w:rPr>
+        <w:t>Request Body:</w:t>
+      </w:r>
+    </w:p>
+    <w:p>
+      <w:pPr>
+        <w:pStyle w:val="Heading2"/>
+        <w:rPr>
+          <w:rFonts w:ascii="Arial" w:hAnsi="Arial" w:cs="Arial"/>
+          <w:sz w:val="21"/>
+          <w:szCs w:val="21"/>
+        </w:rPr>
+      </w:pPr>
+      <w:r>
+        <w:rPr>
+          <w:rFonts w:ascii="Arial" w:hAnsi="Arial" w:cs="Arial"/>
+          <w:sz w:val="21"/>
+          <w:szCs w:val="21"/>
+        </w:rPr>
         <w:lastRenderedPageBreak/>
-        <w:t>Request Body:</w:t>
-      </w:r>
-    </w:p>
-    <w:p>
-      <w:pPr>
-        <w:pStyle w:val="Heading2"/>
-        <w:rPr>
-          <w:rFonts w:ascii="Arial" w:hAnsi="Arial" w:cs="Arial"/>
-          <w:sz w:val="21"/>
-          <w:szCs w:val="21"/>
-        </w:rPr>
-      </w:pPr>
-      <w:r>
-        <w:rPr>
-          <w:rFonts w:ascii="Arial" w:hAnsi="Arial" w:cs="Arial"/>
-          <w:sz w:val="21"/>
-          <w:szCs w:val="21"/>
-        </w:rPr>
         <w:t>json</w:t>
       </w:r>
     </w:p>
@@ -2023,46 +2055,46 @@
           <w:szCs w:val="21"/>
           <w:bdr w:val="single" w:sz="2" w:space="0" w:color="E5E7EB" w:frame="1"/>
         </w:rPr>
+        <w:t xml:space="preserve">  "</w:t>
+      </w:r>
+      <w:proofErr w:type="spellStart"/>
+      <w:r>
+        <w:rPr>
+          <w:rFonts w:ascii="Courier New" w:hAnsi="Courier New" w:cs="Courier New"/>
+          <w:sz w:val="21"/>
+          <w:szCs w:val="21"/>
+          <w:bdr w:val="single" w:sz="2" w:space="0" w:color="E5E7EB" w:frame="1"/>
+        </w:rPr>
+        <w:t>displayName</w:t>
+      </w:r>
+      <w:proofErr w:type="spellEnd"/>
+      <w:r>
+        <w:rPr>
+          <w:rFonts w:ascii="Courier New" w:hAnsi="Courier New" w:cs="Courier New"/>
+          <w:sz w:val="21"/>
+          <w:szCs w:val="21"/>
+          <w:bdr w:val="single" w:sz="2" w:space="0" w:color="E5E7EB" w:frame="1"/>
+        </w:rPr>
+        <w:t>": "John Smith",</w:t>
+      </w:r>
+    </w:p>
+    <w:p>
+      <w:pPr>
+        <w:pStyle w:val="Heading2"/>
+        <w:rPr>
+          <w:rFonts w:ascii="Courier New" w:hAnsi="Courier New" w:cs="Courier New"/>
+          <w:sz w:val="21"/>
+          <w:szCs w:val="21"/>
+        </w:rPr>
+      </w:pPr>
+      <w:r>
+        <w:rPr>
+          <w:rFonts w:ascii="Courier New" w:hAnsi="Courier New" w:cs="Courier New"/>
+          <w:sz w:val="21"/>
+          <w:szCs w:val="21"/>
+          <w:bdr w:val="single" w:sz="2" w:space="0" w:color="E5E7EB" w:frame="1"/>
+        </w:rPr>
         <w:lastRenderedPageBreak/>
-        <w:t xml:space="preserve">  "</w:t>
-      </w:r>
-      <w:proofErr w:type="spellStart"/>
-      <w:r>
-        <w:rPr>
-          <w:rFonts w:ascii="Courier New" w:hAnsi="Courier New" w:cs="Courier New"/>
-          <w:sz w:val="21"/>
-          <w:szCs w:val="21"/>
-          <w:bdr w:val="single" w:sz="2" w:space="0" w:color="E5E7EB" w:frame="1"/>
-        </w:rPr>
-        <w:t>displayName</w:t>
-      </w:r>
-      <w:proofErr w:type="spellEnd"/>
-      <w:r>
-        <w:rPr>
-          <w:rFonts w:ascii="Courier New" w:hAnsi="Courier New" w:cs="Courier New"/>
-          <w:sz w:val="21"/>
-          <w:szCs w:val="21"/>
-          <w:bdr w:val="single" w:sz="2" w:space="0" w:color="E5E7EB" w:frame="1"/>
-        </w:rPr>
-        <w:t>": "John Smith",</w:t>
-      </w:r>
-    </w:p>
-    <w:p>
-      <w:pPr>
-        <w:pStyle w:val="Heading2"/>
-        <w:rPr>
-          <w:rFonts w:ascii="Courier New" w:hAnsi="Courier New" w:cs="Courier New"/>
-          <w:sz w:val="21"/>
-          <w:szCs w:val="21"/>
-        </w:rPr>
-      </w:pPr>
-      <w:r>
-        <w:rPr>
-          <w:rFonts w:ascii="Courier New" w:hAnsi="Courier New" w:cs="Courier New"/>
-          <w:sz w:val="21"/>
-          <w:szCs w:val="21"/>
-          <w:bdr w:val="single" w:sz="2" w:space="0" w:color="E5E7EB" w:frame="1"/>
-        </w:rPr>
         <w:t xml:space="preserve">  "gender": "male",</w:t>
       </w:r>
     </w:p>
@@ -2775,26 +2807,26 @@
           <w:sz w:val="21"/>
           <w:szCs w:val="21"/>
         </w:rPr>
+        <w:t>json</w:t>
+      </w:r>
+    </w:p>
+    <w:p>
+      <w:pPr>
+        <w:pStyle w:val="Heading2"/>
+        <w:rPr>
+          <w:rFonts w:ascii="Courier New" w:hAnsi="Courier New" w:cs="Courier New"/>
+          <w:sz w:val="21"/>
+          <w:szCs w:val="21"/>
+        </w:rPr>
+      </w:pPr>
+      <w:r>
+        <w:rPr>
+          <w:rFonts w:ascii="Courier New" w:hAnsi="Courier New" w:cs="Courier New"/>
+          <w:sz w:val="21"/>
+          <w:szCs w:val="21"/>
+          <w:bdr w:val="single" w:sz="2" w:space="0" w:color="E5E7EB" w:frame="1"/>
+        </w:rPr>
         <w:lastRenderedPageBreak/>
-        <w:t>json</w:t>
-      </w:r>
-    </w:p>
-    <w:p>
-      <w:pPr>
-        <w:pStyle w:val="Heading2"/>
-        <w:rPr>
-          <w:rFonts w:ascii="Courier New" w:hAnsi="Courier New" w:cs="Courier New"/>
-          <w:sz w:val="21"/>
-          <w:szCs w:val="21"/>
-        </w:rPr>
-      </w:pPr>
-      <w:r>
-        <w:rPr>
-          <w:rFonts w:ascii="Courier New" w:hAnsi="Courier New" w:cs="Courier New"/>
-          <w:sz w:val="21"/>
-          <w:szCs w:val="21"/>
-          <w:bdr w:val="single" w:sz="2" w:space="0" w:color="E5E7EB" w:frame="1"/>
-        </w:rPr>
         <w:t>{</w:t>
       </w:r>
     </w:p>
@@ -3366,31 +3398,31 @@
           <w:szCs w:val="21"/>
           <w:bdr w:val="single" w:sz="2" w:space="0" w:color="E5E7EB" w:frame="1"/>
         </w:rPr>
+        <w:t>Critical Flow:</w:t>
+      </w:r>
+      <w:r>
+        <w:rPr>
+          <w:sz w:val="21"/>
+          <w:szCs w:val="21"/>
+        </w:rPr>
+        <w:t> To map a role to a user, you must perform a "Project Grant". This links the user to the project with specific roles.</w:t>
+      </w:r>
+    </w:p>
+    <w:p>
+      <w:pPr>
+        <w:pStyle w:val="Heading2"/>
+        <w:rPr>
+          <w:sz w:val="21"/>
+          <w:szCs w:val="21"/>
+        </w:rPr>
+      </w:pPr>
+      <w:r>
+        <w:rPr>
+          <w:sz w:val="21"/>
+          <w:szCs w:val="21"/>
+          <w:bdr w:val="single" w:sz="2" w:space="0" w:color="E5E7EB" w:frame="1"/>
+        </w:rPr>
         <w:lastRenderedPageBreak/>
-        <w:t>Critical Flow:</w:t>
-      </w:r>
-      <w:r>
-        <w:rPr>
-          <w:sz w:val="21"/>
-          <w:szCs w:val="21"/>
-        </w:rPr>
-        <w:t> To map a role to a user, you must perform a "Project Grant". This links the user to the project with specific roles.</w:t>
-      </w:r>
-    </w:p>
-    <w:p>
-      <w:pPr>
-        <w:pStyle w:val="Heading2"/>
-        <w:rPr>
-          <w:sz w:val="21"/>
-          <w:szCs w:val="21"/>
-        </w:rPr>
-      </w:pPr>
-      <w:r>
-        <w:rPr>
-          <w:sz w:val="21"/>
-          <w:szCs w:val="21"/>
-          <w:bdr w:val="single" w:sz="2" w:space="0" w:color="E5E7EB" w:frame="1"/>
-        </w:rPr>
         <w:t>Endpoint:</w:t>
       </w:r>
       <w:r>
@@ -4140,65 +4172,65 @@
           <w:szCs w:val="21"/>
           <w:bdr w:val="single" w:sz="2" w:space="0" w:color="E5E7EB" w:frame="1"/>
         </w:rPr>
+        <w:t>{</w:t>
+      </w:r>
+    </w:p>
+    <w:p>
+      <w:pPr>
+        <w:pStyle w:val="Heading2"/>
+        <w:rPr>
+          <w:rFonts w:ascii="Courier New" w:hAnsi="Courier New" w:cs="Courier New"/>
+          <w:sz w:val="21"/>
+          <w:szCs w:val="21"/>
+        </w:rPr>
+      </w:pPr>
+      <w:r>
+        <w:rPr>
+          <w:rFonts w:ascii="Courier New" w:hAnsi="Courier New" w:cs="Courier New"/>
+          <w:sz w:val="21"/>
+          <w:szCs w:val="21"/>
+          <w:bdr w:val="single" w:sz="2" w:space="0" w:color="E5E7EB" w:frame="1"/>
+        </w:rPr>
+        <w:t xml:space="preserve">  "</w:t>
+      </w:r>
+      <w:proofErr w:type="spellStart"/>
+      <w:r>
+        <w:rPr>
+          <w:rFonts w:ascii="Courier New" w:hAnsi="Courier New" w:cs="Courier New"/>
+          <w:sz w:val="21"/>
+          <w:szCs w:val="21"/>
+          <w:bdr w:val="single" w:sz="2" w:space="0" w:color="E5E7EB" w:frame="1"/>
+        </w:rPr>
+        <w:t>userIds</w:t>
+      </w:r>
+      <w:proofErr w:type="spellEnd"/>
+      <w:r>
+        <w:rPr>
+          <w:rFonts w:ascii="Courier New" w:hAnsi="Courier New" w:cs="Courier New"/>
+          <w:sz w:val="21"/>
+          <w:szCs w:val="21"/>
+          <w:bdr w:val="single" w:sz="2" w:space="0" w:color="E5E7EB" w:frame="1"/>
+        </w:rPr>
+        <w:t>": ["user_id_1", "user_id_2"],</w:t>
+      </w:r>
+    </w:p>
+    <w:p>
+      <w:pPr>
+        <w:pStyle w:val="Heading2"/>
+        <w:rPr>
+          <w:rFonts w:ascii="Courier New" w:hAnsi="Courier New" w:cs="Courier New"/>
+          <w:sz w:val="21"/>
+          <w:szCs w:val="21"/>
+        </w:rPr>
+      </w:pPr>
+      <w:r>
+        <w:rPr>
+          <w:rFonts w:ascii="Courier New" w:hAnsi="Courier New" w:cs="Courier New"/>
+          <w:sz w:val="21"/>
+          <w:szCs w:val="21"/>
+          <w:bdr w:val="single" w:sz="2" w:space="0" w:color="E5E7EB" w:frame="1"/>
+        </w:rPr>
         <w:lastRenderedPageBreak/>
-        <w:t>{</w:t>
-      </w:r>
-    </w:p>
-    <w:p>
-      <w:pPr>
-        <w:pStyle w:val="Heading2"/>
-        <w:rPr>
-          <w:rFonts w:ascii="Courier New" w:hAnsi="Courier New" w:cs="Courier New"/>
-          <w:sz w:val="21"/>
-          <w:szCs w:val="21"/>
-        </w:rPr>
-      </w:pPr>
-      <w:r>
-        <w:rPr>
-          <w:rFonts w:ascii="Courier New" w:hAnsi="Courier New" w:cs="Courier New"/>
-          <w:sz w:val="21"/>
-          <w:szCs w:val="21"/>
-          <w:bdr w:val="single" w:sz="2" w:space="0" w:color="E5E7EB" w:frame="1"/>
-        </w:rPr>
-        <w:t xml:space="preserve">  "</w:t>
-      </w:r>
-      <w:proofErr w:type="spellStart"/>
-      <w:r>
-        <w:rPr>
-          <w:rFonts w:ascii="Courier New" w:hAnsi="Courier New" w:cs="Courier New"/>
-          <w:sz w:val="21"/>
-          <w:szCs w:val="21"/>
-          <w:bdr w:val="single" w:sz="2" w:space="0" w:color="E5E7EB" w:frame="1"/>
-        </w:rPr>
-        <w:t>userIds</w:t>
-      </w:r>
-      <w:proofErr w:type="spellEnd"/>
-      <w:r>
-        <w:rPr>
-          <w:rFonts w:ascii="Courier New" w:hAnsi="Courier New" w:cs="Courier New"/>
-          <w:sz w:val="21"/>
-          <w:szCs w:val="21"/>
-          <w:bdr w:val="single" w:sz="2" w:space="0" w:color="E5E7EB" w:frame="1"/>
-        </w:rPr>
-        <w:t>": ["user_id_1", "user_id_2"],</w:t>
-      </w:r>
-    </w:p>
-    <w:p>
-      <w:pPr>
-        <w:pStyle w:val="Heading2"/>
-        <w:rPr>
-          <w:rFonts w:ascii="Courier New" w:hAnsi="Courier New" w:cs="Courier New"/>
-          <w:sz w:val="21"/>
-          <w:szCs w:val="21"/>
-        </w:rPr>
-      </w:pPr>
-      <w:r>
-        <w:rPr>
-          <w:rFonts w:ascii="Courier New" w:hAnsi="Courier New" w:cs="Courier New"/>
-          <w:sz w:val="21"/>
-          <w:szCs w:val="21"/>
-          <w:bdr w:val="single" w:sz="2" w:space="0" w:color="E5E7EB" w:frame="1"/>
-        </w:rPr>
         <w:t xml:space="preserve">  "</w:t>
       </w:r>
       <w:proofErr w:type="spellStart"/>

</xml_diff>